<commit_message>
feat(reports): add technology sources and analysis feedback
- Introduce nine coordinated sources across eight formats for Atlas Technology, retaining earlier fixtures.
- Reconcile all periods with independent Decimal totals and preserve original download bytes and source locations.
- Replace the display feedback set with 32 named post-analysis examples and verified human labels.
- Validate document layouts, financial scope, localized presentation and mixed-format source browsing.
</commit_message>
<xml_diff>
--- a/src/features/reports/originals/atlas-ticari-degerlendirme-2025.docx
+++ b/src/features/reports/originals/atlas-ticari-degerlendirme-2025.docx
@@ -7,7 +7,7 @@
         <w:pStyle w:val="Title"/>
       </w:pPr>
       <w:r>
-        <w:t>Atlas Perakende 2025 ticari değerlendirme</w:t>
+        <w:t>Atlas Teknoloji 2025 ticari değerlendirme</w:t>
       </w:r>
     </w:p>
     <w:p>
@@ -20,7 +20,7 @@
     </w:p>
     <w:p>
       <w:r>
-        <w:t>2025 yılında 2.747.949.894,48 TL net satış üreten Atlas Perakende için öncelik, gelir kompozisyonunu katkı ve hizmet kalitesiyle birlikte yönetmektir. Bu değerlendirme dört bölge, üç kanal ve sekiz kategoriye ait aylık toplamları aynı çerçevede birleştirir.</w:t>
+        <w:t>2025 yılında 3.434.937.368,10 TL net satış üreten Atlas Teknoloji için öncelik, gelir kompozisyonunu katkı ve hizmet kalitesiyle birlikte yönetmektir. Bu değerlendirme dört bölge, üç kanal ve sekiz hizmet alanıye ait aylık toplamları aynı çerçevede birleştirir.</w:t>
       </w:r>
     </w:p>
     <w:p>
@@ -33,7 +33,7 @@
     </w:p>
     <w:p>
       <w:r>
-        <w:t>Bu belge sayısal performans raporunun ticari yorumlama çerçevesini tanımlar. Satış kayıtları, aylık bütçe ve teslimat dosyası veri dayanağıdır. Sayısal bulgular gözlem; aşağıdaki karar başlıkları ise yönetimin ek veriyle değerlendireceği önerilerdir.</w:t>
+        <w:t>Bu belge sayısal performans raporunun ticari yorumlama çerçevesini tanımlar. Satış kayıtları, aylık bütçe ve hizmet operasyon dosyası veri dayanağıdır. Sayısal bulgular gözlem; aşağıdaki karar başlıkları ise yönetimin ek veriyle değerlendireceği önerilerdir.</w:t>
       </w:r>
     </w:p>
     <w:tbl>
@@ -144,7 +144,7 @@
                 <w:b w:val="0"/>
                 <w:sz w:val="18"/>
               </w:rPr>
-              <w:t>2.747.949.894,48 TL</w:t>
+              <w:t>3.434.937.368,10 TL</w:t>
             </w:r>
           </w:p>
         </w:tc>
@@ -170,7 +170,7 @@
                 <w:b w:val="0"/>
                 <w:sz w:val="18"/>
               </w:rPr>
-              <w:t>Sipariş</w:t>
+              <w:t>Hizmet işi</w:t>
             </w:r>
           </w:p>
         </w:tc>
@@ -194,7 +194,7 @@
                 <w:b w:val="0"/>
                 <w:sz w:val="18"/>
               </w:rPr>
-              <w:t>1.112.095</w:t>
+              <w:t>279.257</w:t>
             </w:r>
           </w:p>
         </w:tc>
@@ -270,7 +270,7 @@
                 <w:b w:val="0"/>
                 <w:sz w:val="18"/>
               </w:rPr>
-              <w:t>Zamanında teslimat</w:t>
+              <w:t>Zamanında tamamlanma</w:t>
             </w:r>
           </w:p>
         </w:tc>
@@ -294,7 +294,7 @@
                 <w:b w:val="0"/>
                 <w:sz w:val="18"/>
               </w:rPr>
-              <w:t>%94,13</w:t>
+              <w:t>%94,11</w:t>
             </w:r>
           </w:p>
         </w:tc>
@@ -311,7 +311,7 @@
     </w:p>
     <w:p>
       <w:r>
-        <w:t>Önce aylık bütçe ve gerçekleşme tablosunu, sonra kanal ekonomisini inceleyin. Kategori ve bölge kırılımlarıyla gelir bileşimini okuyun. Teslimat oranı ve mali kapsam sınırlamaları, kararın uygulanabilirliğini değerlendirirken birlikte kullanılmalıdır.</w:t>
+        <w:t>Önce aylık bütçe ve gerçekleşme tablosunu, sonra kanal ekonomisini inceleyin. Hizmet alanı ve bölge kırılımlarıyla gelir bileşimini okuyun. Hizmet düzeyi ve mali kapsam sınırlamaları, kararın uygulanabilirliğini değerlendirirken birlikte kullanılmalıdır.</w:t>
       </w:r>
     </w:p>
     <w:p>
@@ -337,7 +337,7 @@
     </w:p>
     <w:p>
       <w:r>
-        <w:t>Kanal performansının değerlendirilmesinde aynı döneme ait net satış, marj ve sipariş hacmi birlikte ele alınır. Kanal cirosu müşteri değeri veya kârlılık sıralaması yerine geçmez.</w:t>
+        <w:t>Kanal performansının değerlendirilmesinde aynı döneme ait net satış, marj ve hizmet işi hacmi birlikte ele alınır. Kanal cirosu müşteri değeri veya kârlılık sıralaması yerine geçmez.</w:t>
       </w:r>
     </w:p>
     <w:p>
@@ -345,12 +345,12 @@
         <w:pStyle w:val="Heading2"/>
       </w:pPr>
       <w:r>
-        <w:t>Web mağazası</w:t>
+        <w:t>Doğrudan satış</w:t>
       </w:r>
     </w:p>
     <w:p>
       <w:r>
-        <w:t>Net satış 1.068.232.821,12 TL, brüt marj %41,83 ve sipariş başına katkı 831,02 TL olarak hesaplanmıştır. Kanalın büyümesi değerlendirilirken iade ve indirim tutarlarıyla kapasite ihtiyacı aynı dönem içinde incelenmelidir.</w:t>
+        <w:t>Net satış 1.335.291.026,40 TL, brüt marj %41,83 ve hizmet işi başına katkı 4.294,45 TL olarak hesaplanmıştır. Kanalın büyümesi değerlendirilirken hizmet kredisi ve indirim tutarlarıyla kapasite ihtiyacı aynı dönem içinde incelenmelidir.</w:t>
       </w:r>
     </w:p>
     <w:p>
@@ -358,12 +358,12 @@
         <w:pStyle w:val="Heading2"/>
       </w:pPr>
       <w:r>
-        <w:t>Pazaryeri</w:t>
+        <w:t>İş ortakları</w:t>
       </w:r>
     </w:p>
     <w:p>
       <w:r>
-        <w:t>Net satış 903.707.969,76 TL, brüt marj %41,81 ve sipariş başına katkı 726,75 TL olarak hesaplanmıştır. Kanalın büyümesi değerlendirilirken iade ve indirim tutarlarıyla kapasite ihtiyacı aynı dönem içinde incelenmelidir.</w:t>
+        <w:t>Net satış 1.129.634.962,20 TL, brüt marj %41,81 ve hizmet işi başına katkı 3.800,88 TL olarak hesaplanmıştır. Kanalın büyümesi değerlendirilirken hizmet kredisi ve indirim tutarlarıyla kapasite ihtiyacı aynı dönem içinde incelenmelidir.</w:t>
       </w:r>
     </w:p>
     <w:p>
@@ -371,12 +371,12 @@
         <w:pStyle w:val="Heading2"/>
       </w:pPr>
       <w:r>
-        <w:t>Mağaza</w:t>
+        <w:t>Dijital kanal</w:t>
       </w:r>
     </w:p>
     <w:p>
       <w:r>
-        <w:t>Net satış 776.009.103,60 TL, brüt marj %41,80 ve sipariş başına katkı 942,69 TL olarak hesaplanmıştır. Kanalın büyümesi değerlendirilirken iade ve indirim tutarlarıyla kapasite ihtiyacı aynı dönem içinde incelenmelidir.</w:t>
+        <w:t>Net satış 970.011.379,50 TL, brüt marj %41,80 ve hizmet işi başına katkı 4.770,22 TL olarak hesaplanmıştır. Kanalın büyümesi değerlendirilirken hizmet kredisi ve indirim tutarlarıyla kapasite ihtiyacı aynı dönem içinde incelenmelidir.</w:t>
       </w:r>
     </w:p>
     <w:p>
@@ -389,7 +389,7 @@
     </w:p>
     <w:p>
       <w:r>
-        <w:t>Müşteri edinme maliyeti, tekrar satın alma, kanal komisyonu ve müşteri yaşam boyu değeri bu dosyada ayrı ölçülmemiştir. Bu nedenle kanallar arasında bütçe aktarımı otomatik sonuç olarak sunulmaz. Birim katkı genel gider ve finansman maliyetlerini içermez.</w:t>
+        <w:t>Müşteri edinme maliyeti, sözleşme yenileme, iş ortağı payı ve müşteri yaşam boyu değeri bu dosyada ayrı ölçülmemiştir. Bu nedenle kanallar arasında bütçe aktarımı otomatik sonuç olarak sunulmaz. Birim katkı genel gider ve finansman maliyetlerini içermez.</w:t>
       </w:r>
     </w:p>
     <w:p>
@@ -415,7 +415,7 @@
     </w:p>
     <w:p>
       <w:r>
-        <w:t>Gelir kırılımları birbirini tamamlar. Aynı satış bir kez kategori, bir kez bölge toplamına girer; farklı boyutların toplamlarını toplamak çift sayım üretir.</w:t>
+        <w:t>Gelir kırılımları birbirini tamamlar. Aynı satış bir kez hizmet alanı, bir kez bölge toplamına girer; farklı boyutların toplamlarını toplamak çift sayım üretir.</w:t>
       </w:r>
     </w:p>
     <w:tbl>
@@ -452,7 +452,7 @@
                 <w:b/>
                 <w:sz w:val="18"/>
               </w:rPr>
-              <w:t>Kategori</w:t>
+              <w:t>Hizmet alanı</w:t>
             </w:r>
           </w:p>
         </w:tc>
@@ -502,7 +502,7 @@
                 <w:b w:val="0"/>
                 <w:sz w:val="18"/>
               </w:rPr>
-              <w:t>Bahçe</w:t>
+              <w:t>Bulut hizmetleri</w:t>
             </w:r>
           </w:p>
         </w:tc>
@@ -526,7 +526,7 @@
                 <w:b w:val="0"/>
                 <w:sz w:val="18"/>
               </w:rPr>
-              <w:t>799.336.623,36 TL</w:t>
+              <w:t>999.170.779,20 TL</w:t>
             </w:r>
           </w:p>
         </w:tc>
@@ -552,7 +552,7 @@
                 <w:b w:val="0"/>
                 <w:sz w:val="18"/>
               </w:rPr>
-              <w:t>Spor</w:t>
+              <w:t>Yönetilen hizmetler</w:t>
             </w:r>
           </w:p>
         </w:tc>
@@ -576,7 +576,7 @@
                 <w:b w:val="0"/>
                 <w:sz w:val="18"/>
               </w:rPr>
-              <w:t>521.320.942,08 TL</w:t>
+              <w:t>651.651.177,60 TL</w:t>
             </w:r>
           </w:p>
         </w:tc>
@@ -602,7 +602,7 @@
                 <w:b w:val="0"/>
                 <w:sz w:val="18"/>
               </w:rPr>
-              <w:t>Elektronik</w:t>
+              <w:t>Kurumsal yazılım</w:t>
             </w:r>
           </w:p>
         </w:tc>
@@ -626,7 +626,7 @@
                 <w:b w:val="0"/>
                 <w:sz w:val="18"/>
               </w:rPr>
-              <w:t>431.038.716,00 TL</w:t>
+              <w:t>538.798.395,00 TL</w:t>
             </w:r>
           </w:p>
         </w:tc>
@@ -652,7 +652,7 @@
                 <w:b w:val="0"/>
                 <w:sz w:val="18"/>
               </w:rPr>
-              <w:t>Giyim</w:t>
+              <w:t>Sistem entegrasyonu</w:t>
             </w:r>
           </w:p>
         </w:tc>
@@ -676,7 +676,7 @@
                 <w:b w:val="0"/>
                 <w:sz w:val="18"/>
               </w:rPr>
-              <w:t>297.899.440,80 TL</w:t>
+              <w:t>372.374.301,00 TL</w:t>
             </w:r>
           </w:p>
         </w:tc>
@@ -702,7 +702,7 @@
                 <w:b w:val="0"/>
                 <w:sz w:val="18"/>
               </w:rPr>
-              <w:t>Ev ve yaşam</w:t>
+              <w:t>Veri analitiği</w:t>
             </w:r>
           </w:p>
         </w:tc>
@@ -726,7 +726,7 @@
                 <w:b w:val="0"/>
                 <w:sz w:val="18"/>
               </w:rPr>
-              <w:t>224.312.768,16 TL</w:t>
+              <w:t>280.390.960,20 TL</w:t>
             </w:r>
           </w:p>
         </w:tc>
@@ -752,7 +752,7 @@
                 <w:b w:val="0"/>
                 <w:sz w:val="18"/>
               </w:rPr>
-              <w:t>Kişisel bakım</w:t>
+              <w:t>Siber güvenlik</w:t>
             </w:r>
           </w:p>
         </w:tc>
@@ -776,7 +776,7 @@
                 <w:b w:val="0"/>
                 <w:sz w:val="18"/>
               </w:rPr>
-              <w:t>197.089.632,00 TL</w:t>
+              <w:t>246.362.040,00 TL</w:t>
             </w:r>
           </w:p>
         </w:tc>
@@ -802,7 +802,7 @@
                 <w:b w:val="0"/>
                 <w:sz w:val="18"/>
               </w:rPr>
-              <w:t>Ofis</w:t>
+              <w:t>Teknik danışmanlık</w:t>
             </w:r>
           </w:p>
         </w:tc>
@@ -826,7 +826,7 @@
                 <w:b w:val="0"/>
                 <w:sz w:val="18"/>
               </w:rPr>
-              <w:t>170.455.639,68 TL</w:t>
+              <w:t>213.069.549,60 TL</w:t>
             </w:r>
           </w:p>
         </w:tc>
@@ -852,7 +852,7 @@
                 <w:b w:val="0"/>
                 <w:sz w:val="18"/>
               </w:rPr>
-              <w:t>Aksesuar</w:t>
+              <w:t>Eğitim hizmetleri</w:t>
             </w:r>
           </w:p>
         </w:tc>
@@ -876,7 +876,7 @@
                 <w:b w:val="0"/>
                 <w:sz w:val="18"/>
               </w:rPr>
-              <w:t>106.496.132,40 TL</w:t>
+              <w:t>133.120.165,50 TL</w:t>
             </w:r>
           </w:p>
         </w:tc>
@@ -893,7 +893,7 @@
     </w:p>
     <w:p>
       <w:r>
-        <w:t>Marmara, Ege, İç Anadolu ve Akdeniz için satış ve teslimat kayıtları aynı ay ve kanal anahtarlarıyla ilişkilendirilir. Bölge büyüklüğü tek başına verimlilik göstergesi değildir; mağaza sayısı, alan, stok ve hizmet kapasitesiyle normalize edilmeden bölge performansı sıralanmaz.</w:t>
+        <w:t>Marmara, Ege, İç Anadolu ve Akdeniz için satış ve hizmet kayıtları aynı ay ve kanal anahtarlarıyla ilişkilendirilir. Bölge büyüklüğü tek başına verimlilik göstergesi değildir; uzman ekip büyüklüğü, hizmet saati ve sözleşme kapsamıyla normalize edilmeden bölge performansı sıralanmaz.</w:t>
       </w:r>
     </w:p>
     <w:p>
@@ -932,7 +932,7 @@
     </w:p>
     <w:p>
       <w:r>
-        <w:t>Satış dosyası aylık kategori ve segment toplamıdır. Siparişler bu kırılımlarda ayrık kabul edilir. Tekil müşteri veya işlem sayısı olarak raporlanmaz. Tüm tutarlar TRY ve KDV hariçtir.</w:t>
+        <w:t>Satış dosyası aylık hizmet alanı ve segment toplamıdır. Hizmet işleri bu kırılımlarda ayrık kabul edilir. Tekil müşteri veya işlem sayısı olarak raporlanmaz. Tüm tutarlar TRY ve KDV hariçtir.</w:t>
       </w:r>
     </w:p>
     <w:p>
@@ -958,7 +958,7 @@
     </w:p>
     <w:p>
       <w:r>
-        <w:t>Zamanında ve gecikmeli siparişler toplamı sevk edilen siparişe eşittir. Satış ve operasyon siparişleri aylık bölge ve kanal anahtarında uzlaştırılır.</w:t>
+        <w:t>Zamanında ve gecikmeli hizmet işleri toplamı tamamlanan hizmet işine eşittir. Satış ve operasyon hizmet işleri aylık bölge ve kanal anahtarında uzlaştırılır.</w:t>
       </w:r>
     </w:p>
     <w:p>
@@ -1183,7 +1183,7 @@
                 <w:b w:val="0"/>
                 <w:sz w:val="18"/>
               </w:rPr>
-              <w:t>Teslimat nedenleri</w:t>
+              <w:t>Hizmet gecikmeleri</w:t>
             </w:r>
           </w:p>
         </w:tc>
@@ -1207,7 +1207,7 @@
                 <w:b w:val="0"/>
                 <w:sz w:val="18"/>
               </w:rPr>
-              <w:t>Operasyon</w:t>
+              <w:t>Hizmet operasyonu</w:t>
             </w:r>
           </w:p>
         </w:tc>
@@ -1231,7 +1231,7 @@
                 <w:b w:val="0"/>
                 <w:sz w:val="18"/>
               </w:rPr>
-              <w:t>Bölge ve taşıyıcı neden kodları</w:t>
+              <w:t>Ekip ve olay bazında neden kodları</w:t>
             </w:r>
           </w:p>
         </w:tc>
@@ -1281,7 +1281,7 @@
                 <w:b w:val="0"/>
                 <w:sz w:val="18"/>
               </w:rPr>
-              <w:t>Kategori yönetimi</w:t>
+              <w:t>Hizmet yönetimi</w:t>
             </w:r>
           </w:p>
         </w:tc>
@@ -1305,7 +1305,7 @@
                 <w:b w:val="0"/>
                 <w:sz w:val="18"/>
               </w:rPr>
-              <w:t>Stok ve tedarik süresi dökümü</w:t>
+              <w:t>Ekip kapasitesi ve yenileme takvimi</w:t>
             </w:r>
           </w:p>
         </w:tc>
@@ -1409,7 +1409,7 @@
     </w:p>
     <w:p>
       <w:r>
-        <w:t>İade nedenleri, taşıyıcı performansı ve stok göstergeleri tamamlandığında karar notunu güncelleyin. Önceki dönemle karşılaştırmada aynı ürün ve kanal kapsamı kullanıldığını doğrulayın. Yeni veri olmadan belirsizliği sayısal güven puanına çevirmeyin.</w:t>
+        <w:t>Hizmet kredisi nedenleri, ekip kapasitesi ve yenileme göstergeleri tamamlandığında karar notunu güncelleyin. Önceki dönemle karşılaştırmada aynı hizmet ve kanal kapsamı kullanıldığını doğrulayın. Yeni veri olmadan belirsizliği sayısal güven puanına çevirmeyin.</w:t>
       </w:r>
     </w:p>
     <w:p>
@@ -1422,7 +1422,7 @@
     </w:p>
     <w:p>
       <w:r>
-        <w:t>atlas-satis-2025.csv satış ve mali kırılımları; atlas-butce-2025.csv aylık hedefleri; atlas-operasyon-2025.csv hizmet oranlarını taşır. atlas-performans-2025.pdf bu kayıtların yıllık yönetim görünümüdür. Bu belge yorumlama ve kontrol çerçevesini tamamlar.</w:t>
+        <w:t>atlas-satis-2025.csv satış ve mali kırılımları; atlas-butce-2025.xlsx aylık hedefleri; atlas-operasyon-2025.csv hizmet oranlarını taşır. atlas-performans-2025.pdf bu kayıtların yıllık yönetim görünümüdür. Bu belge yorumlama ve kontrol çerçevesini tamamlar.</w:t>
       </w:r>
     </w:p>
     <w:sectPr>
@@ -1461,7 +1461,7 @@
       <w:rPr>
         <w:sz w:val="16"/>
       </w:rPr>
-      <w:t>ATLAS PERAKENDE     /     TİCARİ DEĞERLENDİRME 2025</w:t>
+      <w:t>ATLAS TEKNOLOJİ     /     TİCARİ DEĞERLENDİRME 2025</w:t>
     </w:r>
   </w:p>
 </w:hdr>

</xml_diff>